<commit_message>
feat(sdk): expand Core v3 relational surface
Add typed metadata, advanced expressions, canonical DML, typed binds, and reusable engine/session lifecycle. Harden Db2 qualification and fixture evidence.
</commit_message>
<xml_diff>
--- a/docs/PLENORA-CAPABILITIES-CLI-SDK.docx
+++ b/docs/PLENORA-CAPABILITIES-CLI-SDK.docx
@@ -20,7 +20,7 @@
     </w:p>
     <w:p>
       <w:r>
-        <w:t xml:space="preserve">Snapshot degli input 44a9c4f488c4. Contratto attivo: v2.</w:t>
+        <w:t xml:space="preserve">Snapshot degli input dd08029e8b72. Contratto attivo: v2.</w:t>
       </w:r>
     </w:p>
     <w:p>
@@ -2388,12 +2388,12 @@
     </w:p>
     <w:p>
       <w:r>
-        <w:t xml:space="preserve">Tre percorsi coesistono durante la migrazione: SQL raw; builder portable legacy per select/insert/update/delete/upsert; expression language Core v3 che serializza direttamente nell'IR relazionale canonico. Il nuovo primo incremento copre colonne, alias, join, confronti, AND/OR/NOT, distinct, order by, limit e offset.</w:t>
-      </w:r>
-    </w:p>
-    <w:p>
-      <w:r>
-        <w:t xml:space="preserve">Result è oggi uno snapshot bufferizzato: all, first, one, one_or_none, scalar, scalar_one e scalar_one_or_none. Streaming Result, Row tipizzata, funzioni, aggregati, finestre, CTE e DML Core v3 restano passi successivi della roadmap.</w:t>
+        <w:t xml:space="preserve">Tre percorsi coesistono durante la migrazione: SQL raw; builder portable legacy per select/insert/update/delete/upsert; expression language Core v3 che serializza direttamente nell'IR relazionale canonico. La superficie copre colonne, alias, join, predicati, funzioni scalar e aggregate, grouping, window, subquery, CTE, set operation, distinct, order by, limit e offset.</w:t>
+      </w:r>
+    </w:p>
+    <w:p>
+      <w:r>
+        <w:t xml:space="preserve">Result è oggi uno snapshot bufferizzato: all, first, one, one_or_none, scalar, scalar_one e scalar_one_or_none. Row aggiunge accesso per posizione, nome e Column senza cambiare i terminali storici. Streaming Result, DML Core v3, unit of work e migrazioni restano passi successivi della roadmap.</w:t>
       </w:r>
     </w:p>
     <w:p>
@@ -3737,55 +3737,71 @@
         <w:pStyle w:val="Code"/>
       </w:pPr>
       <w:r>
-        <w:t xml:space="preserve">table, column, bind, select, and_, or_, Table, Column, Expression, Predicate, Ordering, BindParameter</w:t>
-      </w:r>
-    </w:p>
-    <w:p>
-      <w:pPr>
-        <w:pStyle w:val="Code"/>
-      </w:pPr>
-      <w:r>
-        <w:t xml:space="preserve">SelectStatement, Result, NoResultFound, MultipleResultsFound, connect, aconnect, connect_mysql, aconnect_mysql, connect_mariadb, aconnect_mariadb, connect_sqlserver, aconnect_sqlserver</w:t>
-      </w:r>
-    </w:p>
-    <w:p>
-      <w:pPr>
-        <w:pStyle w:val="Code"/>
-      </w:pPr>
-      <w:r>
-        <w:t xml:space="preserve">connect_db2, aconnect_db2, DatabaseSession, AsyncDatabaseSession, MysqlSession, AsyncMysqlSession, version, Session, AsyncSession, Transaction, AsyncTransaction, Select</w:t>
-      </w:r>
-    </w:p>
-    <w:p>
-      <w:pPr>
-        <w:pStyle w:val="Code"/>
-      </w:pPr>
-      <w:r>
-        <w:t xml:space="preserve">Insert, Update, Delete, Upsert, AsyncSelect, AsyncInsert, AsyncUpdate, AsyncDelete, AsyncUpsert, spatial, SpatialReference, TypedValue</w:t>
-      </w:r>
-    </w:p>
-    <w:p>
-      <w:pPr>
-        <w:pStyle w:val="Code"/>
-      </w:pPr>
-      <w:r>
-        <w:t xml:space="preserve">uuid, date, timestamp, timestamptz, decimal, null, PlenoraError, PlenoraInvalidPlanError, PlenoraInvalidConfigurationError, PlenoraSchemaError, PlenoraDataMappingError, PlenoraCrsError</w:t>
-      </w:r>
-    </w:p>
-    <w:p>
-      <w:pPr>
-        <w:pStyle w:val="Code"/>
-      </w:pPr>
-      <w:r>
-        <w:t xml:space="preserve">PlenoraUnsupportedError, PlenoraNotFoundError, PlenoraConflictError, PlenoraConcurrentModificationError, PlenoraAuthenticationError, PlenoraAuthorizationError, PlenoraTimeoutError, PlenoraCancelledError, PlenoraResourceLimitError, PlenoraIoError, PlenoraProtocolError, PlenoraTransientError</w:t>
-      </w:r>
-    </w:p>
-    <w:p>
-      <w:pPr>
-        <w:pStyle w:val="Code"/>
-      </w:pPr>
-      <w:r>
-        <w:t xml:space="preserve">PlenoraExecutionError, PlenoraInternalError, PlenoraCommitOutcomeUnknownError, SessionContext</w:t>
+        <w:t xml:space="preserve">table, column, bind, func, select, insert, update, delete, upsert, and_, or_, Table</w:t>
+      </w:r>
+    </w:p>
+    <w:p>
+      <w:pPr>
+        <w:pStyle w:val="Code"/>
+      </w:pPr>
+      <w:r>
+        <w:t xml:space="preserve">Column, CommonTable, DerivedTable, Expression, ExecutableStatement, FunctionExpression, Predicate, Ordering, BindParameter, BindType, ScalarSubquery, SelectStatement</w:t>
+      </w:r>
+    </w:p>
+    <w:p>
+      <w:pPr>
+        <w:pStyle w:val="Code"/>
+      </w:pPr>
+      <w:r>
+        <w:t xml:space="preserve">InsertStatement, UpdateStatement, DeleteStatement, UpsertStatement, WindowExpression, Result, Row, NoResultFound, MultipleResultsFound, MutationResult, MetaData, TableMetadata</w:t>
+      </w:r>
+    </w:p>
+    <w:p>
+      <w:pPr>
+        <w:pStyle w:val="Code"/>
+      </w:pPr>
+      <w:r>
+        <w:t xml:space="preserve">ColumnMetadata, SpatialColumnMetadata, SchemaToken, Observation, NativeAttributes, Index, IndexElement, Constraint, ForeignKey, connect, aconnect, connect_mysql</w:t>
+      </w:r>
+    </w:p>
+    <w:p>
+      <w:pPr>
+        <w:pStyle w:val="Code"/>
+      </w:pPr>
+      <w:r>
+        <w:t xml:space="preserve">aconnect_mysql, connect_mariadb, aconnect_mariadb, connect_sqlserver, aconnect_sqlserver, connect_db2, aconnect_db2, DatabaseSession, AsyncDatabaseSession, MysqlSession, AsyncMysqlSession, version</w:t>
+      </w:r>
+    </w:p>
+    <w:p>
+      <w:pPr>
+        <w:pStyle w:val="Code"/>
+      </w:pPr>
+      <w:r>
+        <w:t xml:space="preserve">Session, AsyncSession, Transaction, AsyncTransaction, Select, Insert, Update, Delete, Upsert, AsyncSelect, AsyncInsert, AsyncUpdate</w:t>
+      </w:r>
+    </w:p>
+    <w:p>
+      <w:pPr>
+        <w:pStyle w:val="Code"/>
+      </w:pPr>
+      <w:r>
+        <w:t xml:space="preserve">AsyncDelete, AsyncUpsert, spatial, SpatialReference, TypedValue, uuid, date, timestamp, timestamptz, decimal, null, PlenoraError</w:t>
+      </w:r>
+    </w:p>
+    <w:p>
+      <w:pPr>
+        <w:pStyle w:val="Code"/>
+      </w:pPr>
+      <w:r>
+        <w:t xml:space="preserve">PlenoraInvalidPlanError, PlenoraInvalidConfigurationError, PlenoraSchemaError, PlenoraDataMappingError, PlenoraCrsError, PlenoraUnsupportedError, PlenoraNotFoundError, PlenoraConflictError, PlenoraConcurrentModificationError, PlenoraAuthenticationError, PlenoraAuthorizationError, PlenoraTimeoutError</w:t>
+      </w:r>
+    </w:p>
+    <w:p>
+      <w:pPr>
+        <w:pStyle w:val="Code"/>
+      </w:pPr>
+      <w:r>
+        <w:t xml:space="preserve">PlenoraCancelledError, PlenoraResourceLimitError, PlenoraIoError, PlenoraProtocolError, PlenoraTransientError, PlenoraExecutionError, PlenoraInternalError, PlenoraCommitOutcomeUnknownError, SessionContext</w:t>
       </w:r>
     </w:p>
     <w:p>
@@ -3841,7 +3857,7 @@
         <w:pStyle w:val="Code"/>
       </w:pPr>
       <w:r>
-        <w:t xml:space="preserve">dispose, is_disposed, provider_kind, session, statistics</w:t>
+        <w:t xml:space="preserve">dispose, invalidate_metadata, is_disposed, metadata_cache_entries, provider_kind, reflect_table, session, statistics</w:t>
       </w:r>
     </w:p>
     <w:p>
@@ -3961,6 +3977,22 @@
         <w:pStyle w:val="Heading3"/>
       </w:pPr>
       <w:r>
+        <w:t xml:space="preserve">BindType</w:t>
+      </w:r>
+    </w:p>
+    <w:p>
+      <w:pPr>
+        <w:pStyle w:val="Code"/>
+      </w:pPr>
+      <w:r>
+        <w:t xml:space="preserve">Nessun metodo pubblico nello stub.</w:t>
+      </w:r>
+    </w:p>
+    <w:p>
+      <w:pPr>
+        <w:pStyle w:val="Heading3"/>
+      </w:pPr>
+      <w:r>
         <w:t xml:space="preserve">Column</w:t>
       </w:r>
     </w:p>
@@ -3977,6 +4009,54 @@
         <w:pStyle w:val="Heading3"/>
       </w:pPr>
       <w:r>
+        <w:t xml:space="preserve">ColumnMetadata</w:t>
+      </w:r>
+    </w:p>
+    <w:p>
+      <w:pPr>
+        <w:pStyle w:val="Code"/>
+      </w:pPr>
+      <w:r>
+        <w:t xml:space="preserve">Nessun metodo pubblico nello stub.</w:t>
+      </w:r>
+    </w:p>
+    <w:p>
+      <w:pPr>
+        <w:pStyle w:val="Heading3"/>
+      </w:pPr>
+      <w:r>
+        <w:t xml:space="preserve">CommonTable</w:t>
+      </w:r>
+    </w:p>
+    <w:p>
+      <w:pPr>
+        <w:pStyle w:val="Code"/>
+      </w:pPr>
+      <w:r>
+        <w:t xml:space="preserve">qualifier, star</w:t>
+      </w:r>
+    </w:p>
+    <w:p>
+      <w:pPr>
+        <w:pStyle w:val="Heading3"/>
+      </w:pPr>
+      <w:r>
+        <w:t xml:space="preserve">Constraint</w:t>
+      </w:r>
+    </w:p>
+    <w:p>
+      <w:pPr>
+        <w:pStyle w:val="Code"/>
+      </w:pPr>
+      <w:r>
+        <w:t xml:space="preserve">Nessun metodo pubblico nello stub.</w:t>
+      </w:r>
+    </w:p>
+    <w:p>
+      <w:pPr>
+        <w:pStyle w:val="Heading3"/>
+      </w:pPr>
+      <w:r>
         <w:t xml:space="preserve">DatabaseSession</w:t>
       </w:r>
     </w:p>
@@ -4009,6 +4089,38 @@
         <w:pStyle w:val="Heading3"/>
       </w:pPr>
       <w:r>
+        <w:t xml:space="preserve">DeleteStatement</w:t>
+      </w:r>
+    </w:p>
+    <w:p>
+      <w:pPr>
+        <w:pStyle w:val="Code"/>
+      </w:pPr>
+      <w:r>
+        <w:t xml:space="preserve">returning, to_ast, to_json, where</w:t>
+      </w:r>
+    </w:p>
+    <w:p>
+      <w:pPr>
+        <w:pStyle w:val="Heading3"/>
+      </w:pPr>
+      <w:r>
+        <w:t xml:space="preserve">DerivedTable</w:t>
+      </w:r>
+    </w:p>
+    <w:p>
+      <w:pPr>
+        <w:pStyle w:val="Code"/>
+      </w:pPr>
+      <w:r>
+        <w:t xml:space="preserve">qualifier, star</w:t>
+      </w:r>
+    </w:p>
+    <w:p>
+      <w:pPr>
+        <w:pStyle w:val="Heading3"/>
+      </w:pPr>
+      <w:r>
         <w:t xml:space="preserve">Engine</w:t>
       </w:r>
     </w:p>
@@ -4017,7 +4129,23 @@
         <w:pStyle w:val="Code"/>
       </w:pPr>
       <w:r>
-        <w:t xml:space="preserve">dispose, is_disposed, provider_kind, session, statistics</w:t>
+        <w:t xml:space="preserve">dispose, invalidate_metadata, is_disposed, metadata_cache_entries, provider_kind, reflect_table, session, statistics</w:t>
+      </w:r>
+    </w:p>
+    <w:p>
+      <w:pPr>
+        <w:pStyle w:val="Heading3"/>
+      </w:pPr>
+      <w:r>
+        <w:t xml:space="preserve">ExecutableStatement</w:t>
+      </w:r>
+    </w:p>
+    <w:p>
+      <w:pPr>
+        <w:pStyle w:val="Code"/>
+      </w:pPr>
+      <w:r>
+        <w:t xml:space="preserve">Nessun metodo pubblico nello stub.</w:t>
       </w:r>
     </w:p>
     <w:p>
@@ -4033,7 +4161,71 @@
         <w:pStyle w:val="Code"/>
       </w:pPr>
       <w:r>
-        <w:t xml:space="preserve">asc, desc, label</w:t>
+        <w:t xml:space="preserve">asc, between, desc, ilike, in_, in_subquery, is_not_null, is_null, label, like, not_between, not_ilike, not_in, not_in_subquery, not_like</w:t>
+      </w:r>
+    </w:p>
+    <w:p>
+      <w:pPr>
+        <w:pStyle w:val="Heading3"/>
+      </w:pPr>
+      <w:r>
+        <w:t xml:space="preserve">ForeignKey</w:t>
+      </w:r>
+    </w:p>
+    <w:p>
+      <w:pPr>
+        <w:pStyle w:val="Code"/>
+      </w:pPr>
+      <w:r>
+        <w:t xml:space="preserve">Nessun metodo pubblico nello stub.</w:t>
+      </w:r>
+    </w:p>
+    <w:p>
+      <w:pPr>
+        <w:pStyle w:val="Heading3"/>
+      </w:pPr>
+      <w:r>
+        <w:t xml:space="preserve">FunctionExpression</w:t>
+      </w:r>
+    </w:p>
+    <w:p>
+      <w:pPr>
+        <w:pStyle w:val="Code"/>
+      </w:pPr>
+      <w:r>
+        <w:t xml:space="preserve">over</w:t>
+      </w:r>
+    </w:p>
+    <w:p>
+      <w:pPr>
+        <w:pStyle w:val="Heading3"/>
+      </w:pPr>
+      <w:r>
+        <w:t xml:space="preserve">Index</w:t>
+      </w:r>
+    </w:p>
+    <w:p>
+      <w:pPr>
+        <w:pStyle w:val="Code"/>
+      </w:pPr>
+      <w:r>
+        <w:t xml:space="preserve">Nessun metodo pubblico nello stub.</w:t>
+      </w:r>
+    </w:p>
+    <w:p>
+      <w:pPr>
+        <w:pStyle w:val="Heading3"/>
+      </w:pPr>
+      <w:r>
+        <w:t xml:space="preserve">IndexElement</w:t>
+      </w:r>
+    </w:p>
+    <w:p>
+      <w:pPr>
+        <w:pStyle w:val="Code"/>
+      </w:pPr>
+      <w:r>
+        <w:t xml:space="preserve">Nessun metodo pubblico nello stub.</w:t>
       </w:r>
     </w:p>
     <w:p>
@@ -4057,6 +4249,38 @@
         <w:pStyle w:val="Heading3"/>
       </w:pPr>
       <w:r>
+        <w:t xml:space="preserve">InsertStatement</w:t>
+      </w:r>
+    </w:p>
+    <w:p>
+      <w:pPr>
+        <w:pStyle w:val="Code"/>
+      </w:pPr>
+      <w:r>
+        <w:t xml:space="preserve">returning, to_ast, to_json, values</w:t>
+      </w:r>
+    </w:p>
+    <w:p>
+      <w:pPr>
+        <w:pStyle w:val="Heading3"/>
+      </w:pPr>
+      <w:r>
+        <w:t xml:space="preserve">MetaData</w:t>
+      </w:r>
+    </w:p>
+    <w:p>
+      <w:pPr>
+        <w:pStyle w:val="Code"/>
+      </w:pPr>
+      <w:r>
+        <w:t xml:space="preserve">from_document, one_table, table</w:t>
+      </w:r>
+    </w:p>
+    <w:p>
+      <w:pPr>
+        <w:pStyle w:val="Heading3"/>
+      </w:pPr>
+      <w:r>
         <w:t xml:space="preserve">MultipleResultsFound</w:t>
       </w:r>
     </w:p>
@@ -4073,6 +4297,38 @@
         <w:pStyle w:val="Heading3"/>
       </w:pPr>
       <w:r>
+        <w:t xml:space="preserve">MutationResult</w:t>
+      </w:r>
+    </w:p>
+    <w:p>
+      <w:pPr>
+        <w:pStyle w:val="Code"/>
+      </w:pPr>
+      <w:r>
+        <w:t xml:space="preserve">count_is_known</w:t>
+      </w:r>
+    </w:p>
+    <w:p>
+      <w:pPr>
+        <w:pStyle w:val="Heading3"/>
+      </w:pPr>
+      <w:r>
+        <w:t xml:space="preserve">NativeAttributes</w:t>
+      </w:r>
+    </w:p>
+    <w:p>
+      <w:pPr>
+        <w:pStyle w:val="Code"/>
+      </w:pPr>
+      <w:r>
+        <w:t xml:space="preserve">from_raw, get, items</w:t>
+      </w:r>
+    </w:p>
+    <w:p>
+      <w:pPr>
+        <w:pStyle w:val="Heading3"/>
+      </w:pPr>
+      <w:r>
         <w:t xml:space="preserve">NoResultFound</w:t>
       </w:r>
     </w:p>
@@ -4089,6 +4345,22 @@
         <w:pStyle w:val="Heading3"/>
       </w:pPr>
       <w:r>
+        <w:t xml:space="preserve">Observation</w:t>
+      </w:r>
+    </w:p>
+    <w:p>
+      <w:pPr>
+        <w:pStyle w:val="Code"/>
+      </w:pPr>
+      <w:r>
+        <w:t xml:space="preserve">Nessun metodo pubblico nello stub.</w:t>
+      </w:r>
+    </w:p>
+    <w:p>
+      <w:pPr>
+        <w:pStyle w:val="Heading3"/>
+      </w:pPr>
+      <w:r>
         <w:t xml:space="preserve">Ordering</w:t>
       </w:r>
     </w:p>
@@ -4465,7 +4737,55 @@
         <w:pStyle w:val="Code"/>
       </w:pPr>
       <w:r>
-        <w:t xml:space="preserve">all, first, keys, one, one_or_none, scalar, scalar_one, scalar_one_or_none</w:t>
+        <w:t xml:space="preserve">all, first, keys, one, one_or_none, row_first, row_one, row_one_or_none, rows, scalar, scalar_one, scalar_one_or_none, tuples</w:t>
+      </w:r>
+    </w:p>
+    <w:p>
+      <w:pPr>
+        <w:pStyle w:val="Heading3"/>
+      </w:pPr>
+      <w:r>
+        <w:t xml:space="preserve">Row</w:t>
+      </w:r>
+    </w:p>
+    <w:p>
+      <w:pPr>
+        <w:pStyle w:val="Code"/>
+      </w:pPr>
+      <w:r>
+        <w:t xml:space="preserve">as_dict, items, keys, values</w:t>
+      </w:r>
+    </w:p>
+    <w:p>
+      <w:pPr>
+        <w:pStyle w:val="Heading3"/>
+      </w:pPr>
+      <w:r>
+        <w:t xml:space="preserve">ScalarSubquery</w:t>
+      </w:r>
+    </w:p>
+    <w:p>
+      <w:pPr>
+        <w:pStyle w:val="Code"/>
+      </w:pPr>
+      <w:r>
+        <w:t xml:space="preserve">Nessun metodo pubblico nello stub.</w:t>
+      </w:r>
+    </w:p>
+    <w:p>
+      <w:pPr>
+        <w:pStyle w:val="Heading3"/>
+      </w:pPr>
+      <w:r>
+        <w:t xml:space="preserve">SchemaToken</w:t>
+      </w:r>
+    </w:p>
+    <w:p>
+      <w:pPr>
+        <w:pStyle w:val="Code"/>
+      </w:pPr>
+      <w:r>
+        <w:t xml:space="preserve">from_raw</w:t>
       </w:r>
     </w:p>
     <w:p>
@@ -4497,7 +4817,7 @@
         <w:pStyle w:val="Code"/>
       </w:pPr>
       <w:r>
-        <w:t xml:space="preserve">distinct, join, limit, offset, order_by, select_from, to_ast, to_json, where</w:t>
+        <w:t xml:space="preserve">cte, distinct, except_, exists, group_by, having, intersect, join, limit, offset, order_by, scalar_subquery, select_from, subquery, to_ast, to_json, union, where</w:t>
       </w:r>
     </w:p>
     <w:p>
@@ -4537,6 +4857,22 @@
         <w:pStyle w:val="Heading3"/>
       </w:pPr>
       <w:r>
+        <w:t xml:space="preserve">SpatialColumnMetadata</w:t>
+      </w:r>
+    </w:p>
+    <w:p>
+      <w:pPr>
+        <w:pStyle w:val="Code"/>
+      </w:pPr>
+      <w:r>
+        <w:t xml:space="preserve">Nessun metodo pubblico nello stub.</w:t>
+      </w:r>
+    </w:p>
+    <w:p>
+      <w:pPr>
+        <w:pStyle w:val="Heading3"/>
+      </w:pPr>
+      <w:r>
         <w:t xml:space="preserve">SpatialReference</w:t>
       </w:r>
     </w:p>
@@ -4569,6 +4905,22 @@
         <w:pStyle w:val="Heading3"/>
       </w:pPr>
       <w:r>
+        <w:t xml:space="preserve">TableMetadata</w:t>
+      </w:r>
+    </w:p>
+    <w:p>
+      <w:pPr>
+        <w:pStyle w:val="Code"/>
+      </w:pPr>
+      <w:r>
+        <w:t xml:space="preserve">Nessun metodo pubblico nello stub.</w:t>
+      </w:r>
+    </w:p>
+    <w:p>
+      <w:pPr>
+        <w:pStyle w:val="Heading3"/>
+      </w:pPr>
+      <w:r>
         <w:t xml:space="preserve">Transaction</w:t>
       </w:r>
     </w:p>
@@ -4617,6 +4969,22 @@
         <w:pStyle w:val="Heading3"/>
       </w:pPr>
       <w:r>
+        <w:t xml:space="preserve">UpdateStatement</w:t>
+      </w:r>
+    </w:p>
+    <w:p>
+      <w:pPr>
+        <w:pStyle w:val="Code"/>
+      </w:pPr>
+      <w:r>
+        <w:t xml:space="preserve">returning, to_ast, to_json, values, where</w:t>
+      </w:r>
+    </w:p>
+    <w:p>
+      <w:pPr>
+        <w:pStyle w:val="Heading3"/>
+      </w:pPr>
+      <w:r>
         <w:t xml:space="preserve">Upsert</w:t>
       </w:r>
     </w:p>
@@ -4626,6 +4994,38 @@
       </w:pPr>
       <w:r>
         <w:t xml:space="preserve">all, conflict_target, execute, one, returning, rows, to_ast, update_on_conflict, values</w:t>
+      </w:r>
+    </w:p>
+    <w:p>
+      <w:pPr>
+        <w:pStyle w:val="Heading3"/>
+      </w:pPr>
+      <w:r>
+        <w:t xml:space="preserve">UpsertStatement</w:t>
+      </w:r>
+    </w:p>
+    <w:p>
+      <w:pPr>
+        <w:pStyle w:val="Code"/>
+      </w:pPr>
+      <w:r>
+        <w:t xml:space="preserve">on_conflict, returning, set, to_ast, to_json, values</w:t>
+      </w:r>
+    </w:p>
+    <w:p>
+      <w:pPr>
+        <w:pStyle w:val="Heading3"/>
+      </w:pPr>
+      <w:r>
+        <w:t xml:space="preserve">WindowExpression</w:t>
+      </w:r>
+    </w:p>
+    <w:p>
+      <w:pPr>
+        <w:pStyle w:val="Code"/>
+      </w:pPr>
+      <w:r>
+        <w:t xml:space="preserve">Nessun metodo pubblico nello stub.</w:t>
       </w:r>
     </w:p>
     <w:p>

</xml_diff>

<commit_message>
feat(sdk): add declarative ORM-like layer
</commit_message>
<xml_diff>
--- a/docs/PLENORA-CAPABILITIES-CLI-SDK.docx
+++ b/docs/PLENORA-CAPABILITIES-CLI-SDK.docx
@@ -20,7 +20,7 @@
     </w:p>
     <w:p>
       <w:r>
-        <w:t xml:space="preserve">Snapshot degli input dd08029e8b72. Contratto attivo: v2.</w:t>
+        <w:t xml:space="preserve">Snapshot degli input fac8397e893e. Contratto attivo: v2.</w:t>
       </w:r>
     </w:p>
     <w:p>
@@ -2388,12 +2388,12 @@
     </w:p>
     <w:p>
       <w:r>
-        <w:t xml:space="preserve">Tre percorsi coesistono durante la migrazione: SQL raw; builder portable legacy per select/insert/update/delete/upsert; expression language Core v3 che serializza direttamente nell'IR relazionale canonico. La superficie copre colonne, alias, join, predicati, funzioni scalar e aggregate, grouping, window, subquery, CTE, set operation, distinct, order by, limit e offset.</w:t>
-      </w:r>
-    </w:p>
-    <w:p>
-      <w:r>
-        <w:t xml:space="preserve">Result è oggi uno snapshot bufferizzato: all, first, one, one_or_none, scalar, scalar_one e scalar_one_or_none. Row aggiunge accesso per posizione, nome e Column senza cambiare i terminali storici. Streaming Result, DML Core v3, unit of work e migrazioni restano passi successivi della roadmap.</w:t>
+        <w:t xml:space="preserve">L'inventario esatto dell'expression language e delle query pubbliche è generato dagli stub PEP 561 nella sezione 11. I valori applicativi restano nei bind e il supporto concreto di ogni provider si legge dalle capability della connessione.</w:t>
+      </w:r>
+    </w:p>
+    <w:p>
+      <w:r>
+        <w:t xml:space="preserve">Classi e terminali di Result, Row e dello strato ORM-like non sono ricopiati in prosa: la stessa sezione 11 li deriva dalla superficie pubblica che il wheel distribuisce.</w:t>
       </w:r>
     </w:p>
     <w:p>
@@ -3785,7 +3785,31 @@
         <w:pStyle w:val="Code"/>
       </w:pPr>
       <w:r>
-        <w:t xml:space="preserve">AsyncDelete, AsyncUpsert, spatial, SpatialReference, TypedValue, uuid, date, timestamp, timestamptz, decimal, null, PlenoraError</w:t>
+        <w:t xml:space="preserve">AsyncDelete, AsyncUpsert, spatial, SpatialReference, DeclarativeBase, AsyncMigrationRunner, AsyncOrmEntityTupleQuery, Geometry, AsyncOrmQuery, AsyncOrmRowsQuery, AsyncOrmSession, ForeignKeyConstraint</w:t>
+      </w:r>
+    </w:p>
+    <w:p>
+      <w:pPr>
+        <w:pStyle w:val="Code"/>
+      </w:pPr>
+      <w:r>
+        <w:t xml:space="preserve">InstanceInspection, LoaderOption, Mapped, MappedColumn, Mapper, Migration, MigrationRunner, ObjectState, OrmEntityTupleQuery, OrmError, OrmMappingError, OrmMetadata</w:t>
+      </w:r>
+    </w:p>
+    <w:p>
+      <w:pPr>
+        <w:pStyle w:val="Code"/>
+      </w:pPr>
+      <w:r>
+        <w:t xml:space="preserve">OrmQuery, OrmRowsQuery, OrmSession, OrmStateError, OrmUnsupportedError, Registry, Relationship, ServerDefault, StaleObjectError, UniqueConstraint, inspect_instance, joinedload</w:t>
+      </w:r>
+    </w:p>
+    <w:p>
+      <w:pPr>
+        <w:pStyle w:val="Code"/>
+      </w:pPr>
+      <w:r>
+        <w:t xml:space="preserve">mapped_column, mapper_registry, relationship, selectinload, TypedValue, uuid, date, timestamp, timestamptz, decimal, null, PlenoraError</w:t>
       </w:r>
     </w:p>
     <w:p>
@@ -3881,6 +3905,86 @@
         <w:pStyle w:val="Heading3"/>
       </w:pPr>
       <w:r>
+        <w:t xml:space="preserve">AsyncMigrationRunner</w:t>
+      </w:r>
+    </w:p>
+    <w:p>
+      <w:pPr>
+        <w:pStyle w:val="Code"/>
+      </w:pPr>
+      <w:r>
+        <w:t xml:space="preserve">apply, rollback</w:t>
+      </w:r>
+    </w:p>
+    <w:p>
+      <w:pPr>
+        <w:pStyle w:val="Heading3"/>
+      </w:pPr>
+      <w:r>
+        <w:t xml:space="preserve">AsyncOrmEntityTupleQuery</w:t>
+      </w:r>
+    </w:p>
+    <w:p>
+      <w:pPr>
+        <w:pStyle w:val="Code"/>
+      </w:pPr>
+      <w:r>
+        <w:t xml:space="preserve">all, limit, order_by, where</w:t>
+      </w:r>
+    </w:p>
+    <w:p>
+      <w:pPr>
+        <w:pStyle w:val="Heading3"/>
+      </w:pPr>
+      <w:r>
+        <w:t xml:space="preserve">AsyncOrmQuery</w:t>
+      </w:r>
+    </w:p>
+    <w:p>
+      <w:pPr>
+        <w:pStyle w:val="Code"/>
+      </w:pPr>
+      <w:r>
+        <w:t xml:space="preserve">all, first, join, limit, one, one_or_none, options, order_by, project, where, where_related, with_entities</w:t>
+      </w:r>
+    </w:p>
+    <w:p>
+      <w:pPr>
+        <w:pStyle w:val="Heading3"/>
+      </w:pPr>
+      <w:r>
+        <w:t xml:space="preserve">AsyncOrmRowsQuery</w:t>
+      </w:r>
+    </w:p>
+    <w:p>
+      <w:pPr>
+        <w:pStyle w:val="Code"/>
+      </w:pPr>
+      <w:r>
+        <w:t xml:space="preserve">all, limit, order_by, where</w:t>
+      </w:r>
+    </w:p>
+    <w:p>
+      <w:pPr>
+        <w:pStyle w:val="Heading3"/>
+      </w:pPr>
+      <w:r>
+        <w:t xml:space="preserve">AsyncOrmSession</w:t>
+      </w:r>
+    </w:p>
+    <w:p>
+      <w:pPr>
+        <w:pStyle w:val="Code"/>
+      </w:pPr>
+      <w:r>
+        <w:t xml:space="preserve">add, close, commit, delete, expire, expire_all, expunge, flush, get, is_active, listen, load, merge, query, refresh, rollback</w:t>
+      </w:r>
+    </w:p>
+    <w:p>
+      <w:pPr>
+        <w:pStyle w:val="Heading3"/>
+      </w:pPr>
+      <w:r>
         <w:t xml:space="preserve">AsyncSelect</w:t>
       </w:r>
     </w:p>
@@ -4073,6 +4177,22 @@
         <w:pStyle w:val="Heading3"/>
       </w:pPr>
       <w:r>
+        <w:t xml:space="preserve">DeclarativeBase</w:t>
+      </w:r>
+    </w:p>
+    <w:p>
+      <w:pPr>
+        <w:pStyle w:val="Code"/>
+      </w:pPr>
+      <w:r>
+        <w:t xml:space="preserve">Nessun metodo pubblico nello stub.</w:t>
+      </w:r>
+    </w:p>
+    <w:p>
+      <w:pPr>
+        <w:pStyle w:val="Heading3"/>
+      </w:pPr>
+      <w:r>
         <w:t xml:space="preserve">Delete</w:t>
       </w:r>
     </w:p>
@@ -4185,6 +4305,22 @@
         <w:pStyle w:val="Heading3"/>
       </w:pPr>
       <w:r>
+        <w:t xml:space="preserve">ForeignKeyConstraint</w:t>
+      </w:r>
+    </w:p>
+    <w:p>
+      <w:pPr>
+        <w:pStyle w:val="Code"/>
+      </w:pPr>
+      <w:r>
+        <w:t xml:space="preserve">Nessun metodo pubblico nello stub.</w:t>
+      </w:r>
+    </w:p>
+    <w:p>
+      <w:pPr>
+        <w:pStyle w:val="Heading3"/>
+      </w:pPr>
+      <w:r>
         <w:t xml:space="preserve">FunctionExpression</w:t>
       </w:r>
     </w:p>
@@ -4201,6 +4337,22 @@
         <w:pStyle w:val="Heading3"/>
       </w:pPr>
       <w:r>
+        <w:t xml:space="preserve">Geometry</w:t>
+      </w:r>
+    </w:p>
+    <w:p>
+      <w:pPr>
+        <w:pStyle w:val="Code"/>
+      </w:pPr>
+      <w:r>
+        <w:t xml:space="preserve">bind, function, predicate, validate</w:t>
+      </w:r>
+    </w:p>
+    <w:p>
+      <w:pPr>
+        <w:pStyle w:val="Heading3"/>
+      </w:pPr>
+      <w:r>
         <w:t xml:space="preserve">Index</w:t>
       </w:r>
     </w:p>
@@ -4265,6 +4417,70 @@
         <w:pStyle w:val="Heading3"/>
       </w:pPr>
       <w:r>
+        <w:t xml:space="preserve">InstanceInspection</w:t>
+      </w:r>
+    </w:p>
+    <w:p>
+      <w:pPr>
+        <w:pStyle w:val="Code"/>
+      </w:pPr>
+      <w:r>
+        <w:t xml:space="preserve">Nessun metodo pubblico nello stub.</w:t>
+      </w:r>
+    </w:p>
+    <w:p>
+      <w:pPr>
+        <w:pStyle w:val="Heading3"/>
+      </w:pPr>
+      <w:r>
+        <w:t xml:space="preserve">LoaderOption</w:t>
+      </w:r>
+    </w:p>
+    <w:p>
+      <w:pPr>
+        <w:pStyle w:val="Code"/>
+      </w:pPr>
+      <w:r>
+        <w:t xml:space="preserve">Nessun metodo pubblico nello stub.</w:t>
+      </w:r>
+    </w:p>
+    <w:p>
+      <w:pPr>
+        <w:pStyle w:val="Heading3"/>
+      </w:pPr>
+      <w:r>
+        <w:t xml:space="preserve">MappedColumn</w:t>
+      </w:r>
+    </w:p>
+    <w:p>
+      <w:pPr>
+        <w:pStyle w:val="Code"/>
+      </w:pPr>
+      <w:r>
+        <w:t xml:space="preserve">Nessun metodo pubblico nello stub.</w:t>
+      </w:r>
+    </w:p>
+    <w:p>
+      <w:pPr>
+        <w:pStyle w:val="Heading3"/>
+      </w:pPr>
+      <w:r>
+        <w:t xml:space="preserve">Mapper</w:t>
+      </w:r>
+    </w:p>
+    <w:p>
+      <w:pPr>
+        <w:pStyle w:val="Code"/>
+      </w:pPr>
+      <w:r>
+        <w:t xml:space="preserve">attribute, relationship</w:t>
+      </w:r>
+    </w:p>
+    <w:p>
+      <w:pPr>
+        <w:pStyle w:val="Heading3"/>
+      </w:pPr>
+      <w:r>
         <w:t xml:space="preserve">MetaData</w:t>
       </w:r>
     </w:p>
@@ -4281,6 +4497,38 @@
         <w:pStyle w:val="Heading3"/>
       </w:pPr>
       <w:r>
+        <w:t xml:space="preserve">Migration</w:t>
+      </w:r>
+    </w:p>
+    <w:p>
+      <w:pPr>
+        <w:pStyle w:val="Code"/>
+      </w:pPr>
+      <w:r>
+        <w:t xml:space="preserve">Nessun metodo pubblico nello stub.</w:t>
+      </w:r>
+    </w:p>
+    <w:p>
+      <w:pPr>
+        <w:pStyle w:val="Heading3"/>
+      </w:pPr>
+      <w:r>
+        <w:t xml:space="preserve">MigrationRunner</w:t>
+      </w:r>
+    </w:p>
+    <w:p>
+      <w:pPr>
+        <w:pStyle w:val="Code"/>
+      </w:pPr>
+      <w:r>
+        <w:t xml:space="preserve">apply, rollback</w:t>
+      </w:r>
+    </w:p>
+    <w:p>
+      <w:pPr>
+        <w:pStyle w:val="Heading3"/>
+      </w:pPr>
+      <w:r>
         <w:t xml:space="preserve">MultipleResultsFound</w:t>
       </w:r>
     </w:p>
@@ -4345,6 +4593,22 @@
         <w:pStyle w:val="Heading3"/>
       </w:pPr>
       <w:r>
+        <w:t xml:space="preserve">ObjectState</w:t>
+      </w:r>
+    </w:p>
+    <w:p>
+      <w:pPr>
+        <w:pStyle w:val="Code"/>
+      </w:pPr>
+      <w:r>
+        <w:t xml:space="preserve">Nessun metodo pubblico nello stub.</w:t>
+      </w:r>
+    </w:p>
+    <w:p>
+      <w:pPr>
+        <w:pStyle w:val="Heading3"/>
+      </w:pPr>
+      <w:r>
         <w:t xml:space="preserve">Observation</w:t>
       </w:r>
     </w:p>
@@ -4377,6 +4641,150 @@
         <w:pStyle w:val="Heading3"/>
       </w:pPr>
       <w:r>
+        <w:t xml:space="preserve">OrmEntityTupleQuery</w:t>
+      </w:r>
+    </w:p>
+    <w:p>
+      <w:pPr>
+        <w:pStyle w:val="Code"/>
+      </w:pPr>
+      <w:r>
+        <w:t xml:space="preserve">all, limit, order_by, where</w:t>
+      </w:r>
+    </w:p>
+    <w:p>
+      <w:pPr>
+        <w:pStyle w:val="Heading3"/>
+      </w:pPr>
+      <w:r>
+        <w:t xml:space="preserve">OrmError</w:t>
+      </w:r>
+    </w:p>
+    <w:p>
+      <w:pPr>
+        <w:pStyle w:val="Code"/>
+      </w:pPr>
+      <w:r>
+        <w:t xml:space="preserve">Nessun metodo pubblico nello stub.</w:t>
+      </w:r>
+    </w:p>
+    <w:p>
+      <w:pPr>
+        <w:pStyle w:val="Heading3"/>
+      </w:pPr>
+      <w:r>
+        <w:t xml:space="preserve">OrmMappingError</w:t>
+      </w:r>
+    </w:p>
+    <w:p>
+      <w:pPr>
+        <w:pStyle w:val="Code"/>
+      </w:pPr>
+      <w:r>
+        <w:t xml:space="preserve">Nessun metodo pubblico nello stub.</w:t>
+      </w:r>
+    </w:p>
+    <w:p>
+      <w:pPr>
+        <w:pStyle w:val="Heading3"/>
+      </w:pPr>
+      <w:r>
+        <w:t xml:space="preserve">OrmMetadata</w:t>
+      </w:r>
+    </w:p>
+    <w:p>
+      <w:pPr>
+        <w:pStyle w:val="Code"/>
+      </w:pPr>
+      <w:r>
+        <w:t xml:space="preserve">create_all, create_all_async, ddl, drop_all, drop_all_async, mappers</w:t>
+      </w:r>
+    </w:p>
+    <w:p>
+      <w:pPr>
+        <w:pStyle w:val="Heading3"/>
+      </w:pPr>
+      <w:r>
+        <w:t xml:space="preserve">OrmQuery</w:t>
+      </w:r>
+    </w:p>
+    <w:p>
+      <w:pPr>
+        <w:pStyle w:val="Code"/>
+      </w:pPr>
+      <w:r>
+        <w:t xml:space="preserve">all, first, join, limit, one, one_or_none, options, order_by, project, where, where_related, with_entities</w:t>
+      </w:r>
+    </w:p>
+    <w:p>
+      <w:pPr>
+        <w:pStyle w:val="Heading3"/>
+      </w:pPr>
+      <w:r>
+        <w:t xml:space="preserve">OrmRowsQuery</w:t>
+      </w:r>
+    </w:p>
+    <w:p>
+      <w:pPr>
+        <w:pStyle w:val="Code"/>
+      </w:pPr>
+      <w:r>
+        <w:t xml:space="preserve">all, limit, order_by, where</w:t>
+      </w:r>
+    </w:p>
+    <w:p>
+      <w:pPr>
+        <w:pStyle w:val="Heading3"/>
+      </w:pPr>
+      <w:r>
+        <w:t xml:space="preserve">OrmSession</w:t>
+      </w:r>
+    </w:p>
+    <w:p>
+      <w:pPr>
+        <w:pStyle w:val="Code"/>
+      </w:pPr>
+      <w:r>
+        <w:t xml:space="preserve">add, close, commit, delete, expire, expire_all, expunge, flush, get, is_active, listen, load, merge, query, refresh, rollback</w:t>
+      </w:r>
+    </w:p>
+    <w:p>
+      <w:pPr>
+        <w:pStyle w:val="Heading3"/>
+      </w:pPr>
+      <w:r>
+        <w:t xml:space="preserve">OrmStateError</w:t>
+      </w:r>
+    </w:p>
+    <w:p>
+      <w:pPr>
+        <w:pStyle w:val="Code"/>
+      </w:pPr>
+      <w:r>
+        <w:t xml:space="preserve">Nessun metodo pubblico nello stub.</w:t>
+      </w:r>
+    </w:p>
+    <w:p>
+      <w:pPr>
+        <w:pStyle w:val="Heading3"/>
+      </w:pPr>
+      <w:r>
+        <w:t xml:space="preserve">OrmUnsupportedError</w:t>
+      </w:r>
+    </w:p>
+    <w:p>
+      <w:pPr>
+        <w:pStyle w:val="Code"/>
+      </w:pPr>
+      <w:r>
+        <w:t xml:space="preserve">Nessun metodo pubblico nello stub.</w:t>
+      </w:r>
+    </w:p>
+    <w:p>
+      <w:pPr>
+        <w:pStyle w:val="Heading3"/>
+      </w:pPr>
+      <w:r>
         <w:t xml:space="preserve">PlenoraAuthenticationError</w:t>
       </w:r>
     </w:p>
@@ -4729,6 +5137,38 @@
         <w:pStyle w:val="Heading3"/>
       </w:pPr>
       <w:r>
+        <w:t xml:space="preserve">Registry</w:t>
+      </w:r>
+    </w:p>
+    <w:p>
+      <w:pPr>
+        <w:pStyle w:val="Code"/>
+      </w:pPr>
+      <w:r>
+        <w:t xml:space="preserve">mapper_for, mappers</w:t>
+      </w:r>
+    </w:p>
+    <w:p>
+      <w:pPr>
+        <w:pStyle w:val="Heading3"/>
+      </w:pPr>
+      <w:r>
+        <w:t xml:space="preserve">Relationship</w:t>
+      </w:r>
+    </w:p>
+    <w:p>
+      <w:pPr>
+        <w:pStyle w:val="Code"/>
+      </w:pPr>
+      <w:r>
+        <w:t xml:space="preserve">direction, target</w:t>
+      </w:r>
+    </w:p>
+    <w:p>
+      <w:pPr>
+        <w:pStyle w:val="Heading3"/>
+      </w:pPr>
+      <w:r>
         <w:t xml:space="preserve">Result</w:t>
       </w:r>
     </w:p>
@@ -4825,6 +5265,22 @@
         <w:pStyle w:val="Heading3"/>
       </w:pPr>
       <w:r>
+        <w:t xml:space="preserve">ServerDefault</w:t>
+      </w:r>
+    </w:p>
+    <w:p>
+      <w:pPr>
+        <w:pStyle w:val="Code"/>
+      </w:pPr>
+      <w:r>
+        <w:t xml:space="preserve">current_timestamp, literal</w:t>
+      </w:r>
+    </w:p>
+    <w:p>
+      <w:pPr>
+        <w:pStyle w:val="Heading3"/>
+      </w:pPr>
+      <w:r>
         <w:t xml:space="preserve">Session</w:t>
       </w:r>
     </w:p>
@@ -4889,6 +5345,22 @@
         <w:pStyle w:val="Heading3"/>
       </w:pPr>
       <w:r>
+        <w:t xml:space="preserve">StaleObjectError</w:t>
+      </w:r>
+    </w:p>
+    <w:p>
+      <w:pPr>
+        <w:pStyle w:val="Code"/>
+      </w:pPr>
+      <w:r>
+        <w:t xml:space="preserve">Nessun metodo pubblico nello stub.</w:t>
+      </w:r>
+    </w:p>
+    <w:p>
+      <w:pPr>
+        <w:pStyle w:val="Heading3"/>
+      </w:pPr>
+      <w:r>
         <w:t xml:space="preserve">Table</w:t>
       </w:r>
     </w:p>
@@ -4953,6 +5425,22 @@
         <w:pStyle w:val="Heading3"/>
       </w:pPr>
       <w:r>
+        <w:t xml:space="preserve">UniqueConstraint</w:t>
+      </w:r>
+    </w:p>
+    <w:p>
+      <w:pPr>
+        <w:pStyle w:val="Code"/>
+      </w:pPr>
+      <w:r>
+        <w:t xml:space="preserve">Nessun metodo pubblico nello stub.</w:t>
+      </w:r>
+    </w:p>
+    <w:p>
+      <w:pPr>
+        <w:pStyle w:val="Heading3"/>
+      </w:pPr>
+      <w:r>
         <w:t xml:space="preserve">Update</w:t>
       </w:r>
     </w:p>
@@ -5065,7 +5553,7 @@
         <w:pStyle w:val="ListBullet"/>
       </w:pPr>
       <w:r>
-        <w:t xml:space="preserve">• la libreria non è ancora un ORM completo: identity map, unit of work e migration planner sono roadmap;</w:t>
+        <w:t xml:space="preserve">• la compatibilità SQLAlchemy non è dichiarata in blocco: ogni superficie ORM-like richiede test e gate propri;</w:t>
       </w:r>
     </w:p>
     <w:p>

</xml_diff>

<commit_message>
feat(sdk): add typed JSON ingress
</commit_message>
<xml_diff>
--- a/docs/PLENORA-CAPABILITIES-CLI-SDK.docx
+++ b/docs/PLENORA-CAPABILITIES-CLI-SDK.docx
@@ -20,7 +20,7 @@
     </w:p>
     <w:p>
       <w:r>
-        <w:t xml:space="preserve">Snapshot degli input fac8397e893e. Contratto attivo: v2.</w:t>
+        <w:t xml:space="preserve">Snapshot degli input 993bc020dad4. Contratto attivo: v2.</w:t>
       </w:r>
     </w:p>
     <w:p>
@@ -3785,47 +3785,55 @@
         <w:pStyle w:val="Code"/>
       </w:pPr>
       <w:r>
-        <w:t xml:space="preserve">AsyncDelete, AsyncUpsert, spatial, SpatialReference, DeclarativeBase, AsyncMigrationRunner, AsyncOrmEntityTupleQuery, Geometry, AsyncOrmQuery, AsyncOrmRowsQuery, AsyncOrmSession, ForeignKeyConstraint</w:t>
-      </w:r>
-    </w:p>
-    <w:p>
-      <w:pPr>
-        <w:pStyle w:val="Code"/>
-      </w:pPr>
-      <w:r>
-        <w:t xml:space="preserve">InstanceInspection, LoaderOption, Mapped, MappedColumn, Mapper, Migration, MigrationRunner, ObjectState, OrmEntityTupleQuery, OrmError, OrmMappingError, OrmMetadata</w:t>
-      </w:r>
-    </w:p>
-    <w:p>
-      <w:pPr>
-        <w:pStyle w:val="Code"/>
-      </w:pPr>
-      <w:r>
-        <w:t xml:space="preserve">OrmQuery, OrmRowsQuery, OrmSession, OrmStateError, OrmUnsupportedError, Registry, Relationship, ServerDefault, StaleObjectError, UniqueConstraint, inspect_instance, joinedload</w:t>
-      </w:r>
-    </w:p>
-    <w:p>
-      <w:pPr>
-        <w:pStyle w:val="Code"/>
-      </w:pPr>
-      <w:r>
-        <w:t xml:space="preserve">mapped_column, mapper_registry, relationship, selectinload, TypedValue, uuid, date, timestamp, timestamptz, decimal, null, PlenoraError</w:t>
-      </w:r>
-    </w:p>
-    <w:p>
-      <w:pPr>
-        <w:pStyle w:val="Code"/>
-      </w:pPr>
-      <w:r>
-        <w:t xml:space="preserve">PlenoraInvalidPlanError, PlenoraInvalidConfigurationError, PlenoraSchemaError, PlenoraDataMappingError, PlenoraCrsError, PlenoraUnsupportedError, PlenoraNotFoundError, PlenoraConflictError, PlenoraConcurrentModificationError, PlenoraAuthenticationError, PlenoraAuthorizationError, PlenoraTimeoutError</w:t>
-      </w:r>
-    </w:p>
-    <w:p>
-      <w:pPr>
-        <w:pStyle w:val="Code"/>
-      </w:pPr>
-      <w:r>
-        <w:t xml:space="preserve">PlenoraCancelledError, PlenoraResourceLimitError, PlenoraIoError, PlenoraProtocolError, PlenoraTransientError, PlenoraExecutionError, PlenoraInternalError, PlenoraCommitOutcomeUnknownError, SessionContext</w:t>
+        <w:t xml:space="preserve">AsyncDelete, AsyncUpsert, spatial, SpatialReference, JsonField, JsonGeometry, JsonInput, JsonInputError, JsonSchema, DeclarativeBase, AsyncMigrationRunner, AsyncOrmEntityTupleQuery</w:t>
+      </w:r>
+    </w:p>
+    <w:p>
+      <w:pPr>
+        <w:pStyle w:val="Code"/>
+      </w:pPr>
+      <w:r>
+        <w:t xml:space="preserve">Geometry, AsyncOrmQuery, AsyncOrmRowsQuery, AsyncOrmSession, ForeignKeyConstraint, InstanceInspection, LoaderOption, Mapped, MappedColumn, Mapper, Migration, MigrationRunner</w:t>
+      </w:r>
+    </w:p>
+    <w:p>
+      <w:pPr>
+        <w:pStyle w:val="Code"/>
+      </w:pPr>
+      <w:r>
+        <w:t xml:space="preserve">ObjectState, OrmEntityTupleQuery, OrmError, OrmMappingError, OrmMetadata, OrmQuery, OrmRowsQuery, OrmSession, OrmStateError, OrmUnsupportedError, Registry, Relationship</w:t>
+      </w:r>
+    </w:p>
+    <w:p>
+      <w:pPr>
+        <w:pStyle w:val="Code"/>
+      </w:pPr>
+      <w:r>
+        <w:t xml:space="preserve">ServerDefault, StaleObjectError, UniqueConstraint, inspect_instance, joinedload, mapped_column, mapper_registry, relationship, selectinload, TypedValue, uuid, date</w:t>
+      </w:r>
+    </w:p>
+    <w:p>
+      <w:pPr>
+        <w:pStyle w:val="Code"/>
+      </w:pPr>
+      <w:r>
+        <w:t xml:space="preserve">timestamp, timestamptz, decimal, null, PlenoraError, PlenoraInvalidPlanError, PlenoraInvalidConfigurationError, PlenoraSchemaError, PlenoraDataMappingError, PlenoraCrsError, PlenoraUnsupportedError, PlenoraNotFoundError</w:t>
+      </w:r>
+    </w:p>
+    <w:p>
+      <w:pPr>
+        <w:pStyle w:val="Code"/>
+      </w:pPr>
+      <w:r>
+        <w:t xml:space="preserve">PlenoraConflictError, PlenoraConcurrentModificationError, PlenoraAuthenticationError, PlenoraAuthorizationError, PlenoraTimeoutError, PlenoraCancelledError, PlenoraResourceLimitError, PlenoraIoError, PlenoraProtocolError, PlenoraTransientError, PlenoraExecutionError, PlenoraInternalError</w:t>
+      </w:r>
+    </w:p>
+    <w:p>
+      <w:pPr>
+        <w:pStyle w:val="Code"/>
+      </w:pPr>
+      <w:r>
+        <w:t xml:space="preserve">PlenoraCommitOutcomeUnknownError, SessionContext</w:t>
       </w:r>
     </w:p>
     <w:p>
@@ -4426,6 +4434,86 @@
       </w:pPr>
       <w:r>
         <w:t xml:space="preserve">Nessun metodo pubblico nello stub.</w:t>
+      </w:r>
+    </w:p>
+    <w:p>
+      <w:pPr>
+        <w:pStyle w:val="Heading3"/>
+      </w:pPr>
+      <w:r>
+        <w:t xml:space="preserve">JsonField</w:t>
+      </w:r>
+    </w:p>
+    <w:p>
+      <w:pPr>
+        <w:pStyle w:val="Code"/>
+      </w:pPr>
+      <w:r>
+        <w:t xml:space="preserve">Nessun metodo pubblico nello stub.</w:t>
+      </w:r>
+    </w:p>
+    <w:p>
+      <w:pPr>
+        <w:pStyle w:val="Heading3"/>
+      </w:pPr>
+      <w:r>
+        <w:t xml:space="preserve">JsonGeometry</w:t>
+      </w:r>
+    </w:p>
+    <w:p>
+      <w:pPr>
+        <w:pStyle w:val="Code"/>
+      </w:pPr>
+      <w:r>
+        <w:t xml:space="preserve">orm_type</w:t>
+      </w:r>
+    </w:p>
+    <w:p>
+      <w:pPr>
+        <w:pStyle w:val="Heading3"/>
+      </w:pPr>
+      <w:r>
+        <w:t xml:space="preserve">JsonInput</w:t>
+      </w:r>
+    </w:p>
+    <w:p>
+      <w:pPr>
+        <w:pStyle w:val="Code"/>
+      </w:pPr>
+      <w:r>
+        <w:t xml:space="preserve">abatches, aobjects, arecords, arrow_schema, batches, for_model, objects, records</w:t>
+      </w:r>
+    </w:p>
+    <w:p>
+      <w:pPr>
+        <w:pStyle w:val="Heading3"/>
+      </w:pPr>
+      <w:r>
+        <w:t xml:space="preserve">JsonInputError</w:t>
+      </w:r>
+    </w:p>
+    <w:p>
+      <w:pPr>
+        <w:pStyle w:val="Code"/>
+      </w:pPr>
+      <w:r>
+        <w:t xml:space="preserve">Nessun metodo pubblico nello stub.</w:t>
+      </w:r>
+    </w:p>
+    <w:p>
+      <w:pPr>
+        <w:pStyle w:val="Heading3"/>
+      </w:pPr>
+      <w:r>
+        <w:t xml:space="preserve">JsonSchema</w:t>
+      </w:r>
+    </w:p>
+    <w:p>
+      <w:pPr>
+        <w:pStyle w:val="Code"/>
+      </w:pPr>
+      <w:r>
+        <w:t xml:space="preserve">from_model</w:t>
       </w:r>
     </w:p>
     <w:p>

</xml_diff>

<commit_message>
Add explicit Python int64 bind helper
</commit_message>
<xml_diff>
--- a/docs/PLENORA-CAPABILITIES-CLI-SDK.docx
+++ b/docs/PLENORA-CAPABILITIES-CLI-SDK.docx
@@ -20,7 +20,7 @@
     </w:p>
     <w:p>
       <w:r>
-        <w:t xml:space="preserve">Snapshot degli input 138938d569af. Contratto attivo: v2.</w:t>
+        <w:t xml:space="preserve">Snapshot degli input 8536a06f6899. Contratto attivo: v2.</w:t>
       </w:r>
     </w:p>
     <w:p>
@@ -3809,31 +3809,31 @@
         <w:pStyle w:val="Code"/>
       </w:pPr>
       <w:r>
-        <w:t xml:space="preserve">ServerDefault, StaleObjectError, UniqueConstraint, inspect_instance, joinedload, mapped_column, mapper_registry, relationship, selectinload, TypedValue, uuid, date</w:t>
-      </w:r>
-    </w:p>
-    <w:p>
-      <w:pPr>
-        <w:pStyle w:val="Code"/>
-      </w:pPr>
-      <w:r>
-        <w:t xml:space="preserve">timestamp, timestamptz, decimal, null, PlenoraError, PlenoraInvalidPlanError, PlenoraInvalidConfigurationError, PlenoraSchemaError, PlenoraDataMappingError, PlenoraCrsError, PlenoraUnsupportedError, PlenoraNotFoundError</w:t>
-      </w:r>
-    </w:p>
-    <w:p>
-      <w:pPr>
-        <w:pStyle w:val="Code"/>
-      </w:pPr>
-      <w:r>
-        <w:t xml:space="preserve">PlenoraConflictError, PlenoraConcurrentModificationError, PlenoraAuthenticationError, PlenoraAuthorizationError, PlenoraTimeoutError, PlenoraCancelledError, PlenoraResourceLimitError, PlenoraIoError, PlenoraProtocolError, PlenoraTransientError, PlenoraExecutionError, PlenoraInternalError</w:t>
-      </w:r>
-    </w:p>
-    <w:p>
-      <w:pPr>
-        <w:pStyle w:val="Code"/>
-      </w:pPr>
-      <w:r>
-        <w:t xml:space="preserve">PlenoraCommitOutcomeUnknownError, SessionContext</w:t>
+        <w:t xml:space="preserve">ServerDefault, StaleObjectError, UniqueConstraint, inspect_instance, joinedload, mapped_column, mapper_registry, relationship, selectinload, TypedValue, uuid, int64</w:t>
+      </w:r>
+    </w:p>
+    <w:p>
+      <w:pPr>
+        <w:pStyle w:val="Code"/>
+      </w:pPr>
+      <w:r>
+        <w:t xml:space="preserve">date, timestamp, timestamptz, decimal, null, PlenoraError, PlenoraInvalidPlanError, PlenoraInvalidConfigurationError, PlenoraSchemaError, PlenoraDataMappingError, PlenoraCrsError, PlenoraUnsupportedError</w:t>
+      </w:r>
+    </w:p>
+    <w:p>
+      <w:pPr>
+        <w:pStyle w:val="Code"/>
+      </w:pPr>
+      <w:r>
+        <w:t xml:space="preserve">PlenoraNotFoundError, PlenoraConflictError, PlenoraConcurrentModificationError, PlenoraAuthenticationError, PlenoraAuthorizationError, PlenoraTimeoutError, PlenoraCancelledError, PlenoraResourceLimitError, PlenoraIoError, PlenoraProtocolError, PlenoraTransientError, PlenoraExecutionError</w:t>
+      </w:r>
+    </w:p>
+    <w:p>
+      <w:pPr>
+        <w:pStyle w:val="Code"/>
+      </w:pPr>
+      <w:r>
+        <w:t xml:space="preserve">PlenoraInternalError, PlenoraCommitOutcomeUnknownError, SessionContext</w:t>
       </w:r>
     </w:p>
     <w:p>

</xml_diff>